<commit_message>
Resume: Compliance Analyst @ Teamware Solutions (unknown)
</commit_message>
<xml_diff>
--- a/resumes/Resume_Compliance_Analyst_Teamware_Solutions__unknown_.docx
+++ b/resumes/Resume_Compliance_Analyst_Teamware_Solutions__unknown_.docx
@@ -430,7 +430,7 @@
           <w:sz w:val="19"/>
           <w:szCs w:val="19"/>
         </w:rPr>
-        <w:t>Triaged 50+ weekly inventory reimbursement cases by severity and policy eligibility, following structured case triage and escalation workflows, resulting in timely and accurate case resolution.</w:t>
+        <w:t>Triaged 50+ weekly inventory reimbursement cases by severity and policy eligibility, identifying high-risk cases for senior reviewer escalation.</w:t>
       </w:r>
     </w:p>
     <w:p>
@@ -449,7 +449,7 @@
           <w:sz w:val="19"/>
           <w:szCs w:val="19"/>
         </w:rPr>
-        <w:t>Investigated seller claims, identified policy violations and anomalous patterns, and escalated findings to senior reviewers, ensuring compliance with established policies.</w:t>
+        <w:t>Investigated seller claims, analyzing policy violations and anomalous patterns to inform decision-making and reduce repeat-issue investigation time.</w:t>
       </w:r>
     </w:p>
     <w:p>
@@ -468,7 +468,7 @@
           <w:sz w:val="19"/>
           <w:szCs w:val="19"/>
         </w:rPr>
-        <w:t>Analyzed root cause of seller claims, documenting findings, decisions, evidence, and corrective actions in audit-ready case notes, maintaining compliance tracking.</w:t>
+        <w:t>Maintained audit-ready case documentation with findings, decisions, evidence notes, and corrective actions aligned to evidence documentation and decision trails.</w:t>
       </w:r>
     </w:p>
     <w:p>
@@ -487,7 +487,7 @@
           <w:sz w:val="19"/>
           <w:szCs w:val="19"/>
         </w:rPr>
-        <w:t>Detected recurring fraud patterns, flagging 200+ weekly cases early to reduce investigation time, and enhancing compliance and security.</w:t>
+        <w:t>Documented audit-ready case notes, recording investigation findings, decisions, evidence, and corrective actions</w:t>
       </w:r>
     </w:p>
     <w:p>
@@ -588,7 +588,7 @@
           <w:sz w:val="19"/>
           <w:szCs w:val="19"/>
         </w:rPr>
-        <w:t>Developed multi-API threat intelligence pipeline using Python, submitting suspicious data to VirusTotal, AbuseIPDB, URLScan.io, and cross-referencing WHOIS, DNS, and SSL details for phishing analysis.</w:t>
+        <w:t>Developed multi-source risk assessment pipeline: submits vendor domains and IPs to VirusTotal, AbuseIPDB, and URLScan.io, and cross-references WHOIS, DNS, and SSL certificate details for due diligence.</w:t>
       </w:r>
     </w:p>
     <w:p>
@@ -607,7 +607,7 @@
           <w:sz w:val="19"/>
           <w:szCs w:val="19"/>
         </w:rPr>
-        <w:t>Developed typosquatting detector using Python, AbuseIPDB, and WHOIS to generate domain variants and check live DNS resolution for brand-impersonation analysis.</w:t>
+        <w:t>Developed domain reputation assessment tool detecting typosquatting variants and live DNS resolution for vendor and partner ecosystem review.</w:t>
       </w:r>
     </w:p>
     <w:p>
@@ -626,7 +626,7 @@
           <w:sz w:val="19"/>
           <w:szCs w:val="19"/>
         </w:rPr>
-        <w:t>Deployed Telegram bot interface for live IOC enrichment, supporting bulk CSV input/output and OSINT enrichment via theHarvester for domain profiling.</w:t>
+        <w:t>Deployed Telegram bot for automated risk assessment, supporting bulk CSV input/output and OSINT enrichment via theHarvester for domain profiling.</w:t>
       </w:r>
     </w:p>
     <w:p>
@@ -697,7 +697,7 @@
           <w:sz w:val="19"/>
           <w:szCs w:val="19"/>
         </w:rPr>
-        <w:t>Developed automated vulnerability assessment pipeline integrating Nessus and OpenVAS REST APIs in Python, generating CVE reports with CVSS severity and EPSS context from FIRST.org API.</w:t>
+        <w:t>Developed automated vulnerability assessment pipeline integrating Nessus and OpenVAS APIs in Python, generating audit-ready CVE reports with EPSS context from FIRST.org API and CVSS severity classification.</w:t>
       </w:r>
     </w:p>
     <w:p>
@@ -716,7 +716,7 @@
           <w:sz w:val="19"/>
           <w:szCs w:val="19"/>
         </w:rPr>
-        <w:t>Developed OWASP Top 10 automated web checker using Python, Bash, and Nessus to detect injection, auth, and SSRF vulnerabilities, documenting SQL injection remediation.</w:t>
+        <w:t>Developed OWASP Top 10 automated compliance checker validating web app security controls against regulatory requirements, documenting vulnerability-to-remediation audit trails with SQL injection evidence and parameterised query fixes.</w:t>
       </w:r>
     </w:p>
     <w:p>
@@ -735,7 +735,7 @@
           <w:sz w:val="19"/>
           <w:szCs w:val="19"/>
         </w:rPr>
-        <w:t>Automated scan scheduling with Bash and cron, flagging new CVEs and tracking patch compliance using Python, Bash, and Nessus.</w:t>
+        <w:t>Automated compliance scan scheduling via Bash and cron; built delta-scan logic to track remediation progress and organize audit evidence for patch compliance (remediation tracking) review.</w:t>
       </w:r>
     </w:p>
     <w:p>

</xml_diff>